<commit_message>
Consolidate modification data into the Alterations Log
Replace the redundant ADA Modification Date(s) and Identify ADA
Modifications fields with a single Yes/No gate question per section;
the Alterations Log (Element Altered / Date Altered) is now the only
place modification data lives. The HTML form shows the log fields only
when the gate is Yes. The LOF agent completeness check flags a Yes with
an empty log, a No or blank gate with populated log rows, or a blank
gate.

Co-Authored-By: Claude Fable 5 <noreply@anthropic.com>
Claude-Session: https://claude.ai/code/session_01HDNqGwCX2cB681LcPaj7UL
</commit_message>
<xml_diff>
--- a/cde-facilities-toolset/guide/Program_Access_Staff_Interview.docx
+++ b/cde-facilities-toolset/guide/Program_Access_Staff_Interview.docx
@@ -104,7 +104,7 @@
             </w:pPr>
             <w:sdt>
               <w:sdtPr>
-                <w:id w:val="1723"/>
+                <w:id w:val="1698"/>
                 <w:showingPlcHdr/>
                 <w:text/>
               </w:sdtPr>
@@ -170,7 +170,7 @@
             </w:pPr>
             <w:sdt>
               <w:sdtPr>
-                <w:id w:val="1724"/>
+                <w:id w:val="1699"/>
                 <w:showingPlcHdr/>
                 <w:date>
                   <w:dateFormat w:val="MMMM d, yyyy"/>
@@ -241,7 +241,7 @@
             </w:pPr>
             <w:sdt>
               <w:sdtPr>
-                <w:id w:val="1725"/>
+                <w:id w:val="1700"/>
                 <w:showingPlcHdr/>
                 <w:text/>
               </w:sdtPr>
@@ -307,7 +307,7 @@
             </w:pPr>
             <w:sdt>
               <w:sdtPr>
-                <w:id w:val="1726"/>
+                <w:id w:val="1701"/>
                 <w:showingPlcHdr/>
                 <w:text/>
               </w:sdtPr>
@@ -373,7 +373,7 @@
             </w:pPr>
             <w:sdt>
               <w:sdtPr>
-                <w:id w:val="1727"/>
+                <w:id w:val="1702"/>
                 <w:showingPlcHdr/>
                 <w:text/>
               </w:sdtPr>
@@ -465,7 +465,7 @@
             </w:r>
             <w:sdt>
               <w:sdtPr>
-                <w:id w:val="1728"/>
+                <w:id w:val="1703"/>
                 <w:showingPlcHdr/>
                 <w:text/>
               </w:sdtPr>
@@ -501,7 +501,7 @@
             </w:r>
             <w:sdt>
               <w:sdtPr>
-                <w:id w:val="1729"/>
+                <w:id w:val="1704"/>
                 <w:showingPlcHdr/>
                 <w:text/>
               </w:sdtPr>
@@ -580,7 +580,7 @@
             </w:r>
             <w:sdt>
               <w:sdtPr>
-                <w:id w:val="1730"/>
+                <w:id w:val="1705"/>
                 <w:showingPlcHdr/>
                 <w:text/>
               </w:sdtPr>
@@ -616,7 +616,7 @@
             </w:r>
             <w:sdt>
               <w:sdtPr>
-                <w:id w:val="1731"/>
+                <w:id w:val="1706"/>
                 <w:showingPlcHdr/>
                 <w:text/>
               </w:sdtPr>
@@ -695,7 +695,7 @@
             </w:r>
             <w:sdt>
               <w:sdtPr>
-                <w:id w:val="1732"/>
+                <w:id w:val="1707"/>
                 <w:showingPlcHdr/>
                 <w:text/>
               </w:sdtPr>
@@ -731,7 +731,7 @@
             </w:r>
             <w:sdt>
               <w:sdtPr>
-                <w:id w:val="1733"/>
+                <w:id w:val="1708"/>
                 <w:showingPlcHdr/>
                 <w:text/>
               </w:sdtPr>
@@ -823,7 +823,7 @@
             </w:r>
             <w:sdt>
               <w:sdtPr>
-                <w:id w:val="1734"/>
+                <w:id w:val="1709"/>
                 <w:showingPlcHdr/>
                 <w:text/>
               </w:sdtPr>
@@ -859,7 +859,7 @@
             </w:r>
             <w:sdt>
               <w:sdtPr>
-                <w:id w:val="1735"/>
+                <w:id w:val="1710"/>
                 <w:showingPlcHdr/>
                 <w:text/>
               </w:sdtPr>
@@ -938,7 +938,7 @@
             </w:r>
             <w:sdt>
               <w:sdtPr>
-                <w:id w:val="1736"/>
+                <w:id w:val="1711"/>
                 <w:showingPlcHdr/>
                 <w:text/>
               </w:sdtPr>
@@ -974,7 +974,7 @@
             </w:r>
             <w:sdt>
               <w:sdtPr>
-                <w:id w:val="1737"/>
+                <w:id w:val="1712"/>
                 <w:showingPlcHdr/>
                 <w:text/>
               </w:sdtPr>
@@ -1053,7 +1053,7 @@
             </w:r>
             <w:sdt>
               <w:sdtPr>
-                <w:id w:val="1738"/>
+                <w:id w:val="1713"/>
                 <w:showingPlcHdr/>
                 <w:text/>
               </w:sdtPr>
@@ -1089,7 +1089,7 @@
             </w:r>
             <w:sdt>
               <w:sdtPr>
-                <w:id w:val="1739"/>
+                <w:id w:val="1714"/>
                 <w:showingPlcHdr/>
                 <w:text/>
               </w:sdtPr>
@@ -1168,7 +1168,7 @@
             </w:r>
             <w:sdt>
               <w:sdtPr>
-                <w:id w:val="1740"/>
+                <w:id w:val="1715"/>
                 <w:showingPlcHdr/>
                 <w:text/>
               </w:sdtPr>
@@ -1204,7 +1204,7 @@
             </w:r>
             <w:sdt>
               <w:sdtPr>
-                <w:id w:val="1741"/>
+                <w:id w:val="1716"/>
                 <w:showingPlcHdr/>
                 <w:text/>
               </w:sdtPr>
@@ -1296,7 +1296,7 @@
             </w:r>
             <w:sdt>
               <w:sdtPr>
-                <w:id w:val="1742"/>
+                <w:id w:val="1717"/>
                 <w:showingPlcHdr/>
                 <w:text/>
               </w:sdtPr>
@@ -1332,7 +1332,7 @@
             </w:r>
             <w:sdt>
               <w:sdtPr>
-                <w:id w:val="1743"/>
+                <w:id w:val="1718"/>
                 <w:showingPlcHdr/>
                 <w:text/>
               </w:sdtPr>
@@ -1411,7 +1411,7 @@
             </w:r>
             <w:sdt>
               <w:sdtPr>
-                <w:id w:val="1744"/>
+                <w:id w:val="1719"/>
                 <w:showingPlcHdr/>
                 <w:text/>
               </w:sdtPr>
@@ -1447,7 +1447,7 @@
             </w:r>
             <w:sdt>
               <w:sdtPr>
-                <w:id w:val="1745"/>
+                <w:id w:val="1720"/>
                 <w:showingPlcHdr/>
                 <w:text/>
               </w:sdtPr>
@@ -1526,7 +1526,7 @@
             </w:r>
             <w:sdt>
               <w:sdtPr>
-                <w:id w:val="1746"/>
+                <w:id w:val="1721"/>
                 <w:showingPlcHdr/>
                 <w:text/>
               </w:sdtPr>
@@ -1562,7 +1562,7 @@
             </w:r>
             <w:sdt>
               <w:sdtPr>
-                <w:id w:val="1747"/>
+                <w:id w:val="1722"/>
                 <w:showingPlcHdr/>
                 <w:text/>
               </w:sdtPr>
@@ -1654,7 +1654,7 @@
             </w:r>
             <w:sdt>
               <w:sdtPr>
-                <w:id w:val="1748"/>
+                <w:id w:val="1723"/>
                 <w:showingPlcHdr/>
                 <w:text/>
               </w:sdtPr>
@@ -1690,7 +1690,7 @@
             </w:r>
             <w:sdt>
               <w:sdtPr>
-                <w:id w:val="1749"/>
+                <w:id w:val="1724"/>
                 <w:showingPlcHdr/>
                 <w:text/>
               </w:sdtPr>
@@ -1769,7 +1769,7 @@
             </w:r>
             <w:sdt>
               <w:sdtPr>
-                <w:id w:val="1750"/>
+                <w:id w:val="1725"/>
                 <w:showingPlcHdr/>
                 <w:text/>
               </w:sdtPr>
@@ -1805,7 +1805,7 @@
             </w:r>
             <w:sdt>
               <w:sdtPr>
-                <w:id w:val="1751"/>
+                <w:id w:val="1726"/>
                 <w:showingPlcHdr/>
                 <w:text/>
               </w:sdtPr>
@@ -1897,7 +1897,7 @@
             </w:r>
             <w:sdt>
               <w:sdtPr>
-                <w:id w:val="1752"/>
+                <w:id w:val="1727"/>
                 <w:showingPlcHdr/>
                 <w:text/>
               </w:sdtPr>
@@ -1933,7 +1933,7 @@
             </w:r>
             <w:sdt>
               <w:sdtPr>
-                <w:id w:val="1753"/>
+                <w:id w:val="1728"/>
                 <w:showingPlcHdr/>
                 <w:text/>
               </w:sdtPr>
@@ -2012,7 +2012,7 @@
             </w:r>
             <w:sdt>
               <w:sdtPr>
-                <w:id w:val="1754"/>
+                <w:id w:val="1729"/>
                 <w:showingPlcHdr/>
                 <w:text/>
               </w:sdtPr>
@@ -2048,7 +2048,7 @@
             </w:r>
             <w:sdt>
               <w:sdtPr>
-                <w:id w:val="1755"/>
+                <w:id w:val="1730"/>
                 <w:showingPlcHdr/>
                 <w:text/>
               </w:sdtPr>
@@ -2140,7 +2140,7 @@
             </w:r>
             <w:sdt>
               <w:sdtPr>
-                <w:id w:val="1756"/>
+                <w:id w:val="1731"/>
                 <w:showingPlcHdr/>
                 <w:text/>
               </w:sdtPr>
@@ -2176,7 +2176,7 @@
             </w:r>
             <w:sdt>
               <w:sdtPr>
-                <w:id w:val="1757"/>
+                <w:id w:val="1732"/>
                 <w:showingPlcHdr/>
                 <w:text/>
               </w:sdtPr>

</xml_diff>